<commit_message>
Add View Product Detail (Customer)
</commit_message>
<xml_diff>
--- a/RequirementAnalysis/UCSpec/word/ViewProductDetail.docx
+++ b/RequirementAnalysis/UCSpec/word/ViewProductDetail.docx
@@ -3854,78 +3854,6 @@
     </w:p>
     <w:p>
       <w:pPr>
-        <w:pStyle w:val="Heading1"/>
-        <w:numPr>
-          <w:ilvl w:val="0"/>
-          <w:numId w:val="12"/>
-        </w:numPr>
-        <w:rPr>
-          <w:rFonts w:ascii="Times New Roman" w:hAnsi="Times New Roman" w:cs="Times New Roman"/>
-          <w:sz w:val="24"/>
-          <w:szCs w:val="24"/>
-        </w:rPr>
-      </w:pPr>
-      <w:r>
-        <w:rPr>
-          <w:rFonts w:ascii="Times New Roman" w:hAnsi="Times New Roman" w:cs="Times New Roman"/>
-          <w:sz w:val="24"/>
-          <w:szCs w:val="24"/>
-        </w:rPr>
-        <w:lastRenderedPageBreak/>
-        <w:t>Activity Diagram:</w:t>
-      </w:r>
-    </w:p>
-    <w:p>
-      <w:pPr>
-        <w:rPr>
-          <w:rFonts w:cs="Times New Roman"/>
-          <w:szCs w:val="24"/>
-        </w:rPr>
-      </w:pPr>
-      <w:r>
-        <w:rPr>
-          <w:rFonts w:cs="Times New Roman"/>
-          <w:szCs w:val="24"/>
-        </w:rPr>
-        <w:drawing>
-          <wp:inline distT="0" distB="0" distL="0" distR="0" wp14:anchorId="4ADC0BE0" wp14:editId="263017AC">
-            <wp:extent cx="6080760" cy="7425055"/>
-            <wp:effectExtent l="0" t="0" r="2540" b="4445"/>
-            <wp:docPr id="820908434" name="Picture 1"/>
-            <wp:cNvGraphicFramePr>
-              <a:graphicFrameLocks xmlns:a="http://schemas.openxmlformats.org/drawingml/2006/main" noChangeAspect="1"/>
-            </wp:cNvGraphicFramePr>
-            <a:graphic xmlns:a="http://schemas.openxmlformats.org/drawingml/2006/main">
-              <a:graphicData uri="http://schemas.openxmlformats.org/drawingml/2006/picture">
-                <pic:pic xmlns:pic="http://schemas.openxmlformats.org/drawingml/2006/picture">
-                  <pic:nvPicPr>
-                    <pic:cNvPr id="820908434" name=""/>
-                    <pic:cNvPicPr/>
-                  </pic:nvPicPr>
-                  <pic:blipFill>
-                    <a:blip r:embed="rId6"/>
-                    <a:stretch>
-                      <a:fillRect/>
-                    </a:stretch>
-                  </pic:blipFill>
-                  <pic:spPr>
-                    <a:xfrm>
-                      <a:off x="0" y="0"/>
-                      <a:ext cx="6080760" cy="7425055"/>
-                    </a:xfrm>
-                    <a:prstGeom prst="rect">
-                      <a:avLst/>
-                    </a:prstGeom>
-                  </pic:spPr>
-                </pic:pic>
-              </a:graphicData>
-            </a:graphic>
-          </wp:inline>
-        </w:drawing>
-      </w:r>
-    </w:p>
-    <w:p>
-      <w:pPr>
         <w:rPr>
           <w:rFonts w:cs="Times New Roman"/>
           <w:szCs w:val="24"/>

</xml_diff>

<commit_message>
doc(lab03): save current ViewProductDetail version
</commit_message>
<xml_diff>
--- a/RequirementAnalysis/UCSpec/word/ViewProductDetail.docx
+++ b/RequirementAnalysis/UCSpec/word/ViewProductDetail.docx
@@ -4016,7 +4016,7 @@
   <w:abstractNum w:abstractNumId="7" w15:restartNumberingAfterBreak="0">
     <w:nsid w:val="FFFFFF88"/>
     <w:multiLevelType w:val="singleLevel"/>
-    <w:tmpl w:val="D0A62B40"/>
+    <w:tmpl w:val="7ECA9FBC"/>
     <w:lvl w:ilvl="0">
       <w:start w:val="1"/>
       <w:numFmt w:val="decimal"/>
@@ -4378,6 +4378,12 @@
   </w:num>
   <w:num w:numId="12" w16cid:durableId="1222866968">
     <w:abstractNumId w:val="10"/>
+  </w:num>
+  <w:num w:numId="13" w16cid:durableId="740176048">
+    <w:abstractNumId w:val="7"/>
+  </w:num>
+  <w:num w:numId="14" w16cid:durableId="587152916">
+    <w:abstractNumId w:val="7"/>
   </w:num>
 </w:numbering>
 </file>

</xml_diff>